<commit_message>
ajout du vrai exercice #1
</commit_message>
<xml_diff>
--- a/Labo4_Exercices.docx
+++ b/Labo4_Exercices.docx
@@ -1,6 +1,6 @@
 
 <file path=word/document.xml><?xml version="1.0" encoding="utf-8"?>
-<w:document xmlns:wpc="http://schemas.microsoft.com/office/word/2010/wordprocessingCanvas" xmlns:mc="http://schemas.openxmlformats.org/markup-compatibility/2006" xmlns:o="urn:schemas-microsoft-com:office:office" xmlns:r="http://schemas.openxmlformats.org/officeDocument/2006/relationships" xmlns:m="http://schemas.openxmlformats.org/officeDocument/2006/math" xmlns:v="urn:schemas-microsoft-com:vml" xmlns:wp14="http://schemas.microsoft.com/office/word/2010/wordprocessingDrawing" xmlns:wp="http://schemas.openxmlformats.org/drawingml/2006/wordprocessingDrawing" xmlns:w10="urn:schemas-microsoft-com:office:word" xmlns:w="http://schemas.openxmlformats.org/wordprocessingml/2006/main" xmlns:w14="http://schemas.microsoft.com/office/word/2010/wordml" xmlns:w15="http://schemas.microsoft.com/office/word/2012/wordml" xmlns:wpg="http://schemas.microsoft.com/office/word/2010/wordprocessingGroup" xmlns:wpi="http://schemas.microsoft.com/office/word/2010/wordprocessingInk" xmlns:wne="http://schemas.microsoft.com/office/word/2006/wordml" xmlns:wps="http://schemas.microsoft.com/office/word/2010/wordprocessingShape" mc:Ignorable="w14 w15 wp14">
+<w:document xmlns:wpc="http://schemas.microsoft.com/office/word/2010/wordprocessingCanvas" xmlns:cx="http://schemas.microsoft.com/office/drawing/2014/chartex" xmlns:cx1="http://schemas.microsoft.com/office/drawing/2015/9/8/chartex" xmlns:cx2="http://schemas.microsoft.com/office/drawing/2015/10/21/chartex" xmlns:cx3="http://schemas.microsoft.com/office/drawing/2016/5/9/chartex" xmlns:cx4="http://schemas.microsoft.com/office/drawing/2016/5/10/chartex" xmlns:cx5="http://schemas.microsoft.com/office/drawing/2016/5/11/chartex" xmlns:cx6="http://schemas.microsoft.com/office/drawing/2016/5/12/chartex" xmlns:cx7="http://schemas.microsoft.com/office/drawing/2016/5/13/chartex" xmlns:cx8="http://schemas.microsoft.com/office/drawing/2016/5/14/chartex" xmlns:mc="http://schemas.openxmlformats.org/markup-compatibility/2006" xmlns:aink="http://schemas.microsoft.com/office/drawing/2016/ink" xmlns:am3d="http://schemas.microsoft.com/office/drawing/2017/model3d" xmlns:o="urn:schemas-microsoft-com:office:office" xmlns:oel="http://schemas.microsoft.com/office/2019/extlst" xmlns:r="http://schemas.openxmlformats.org/officeDocument/2006/relationships" xmlns:m="http://schemas.openxmlformats.org/officeDocument/2006/math" xmlns:v="urn:schemas-microsoft-com:vml" xmlns:wp14="http://schemas.microsoft.com/office/word/2010/wordprocessingDrawing" xmlns:wp="http://schemas.openxmlformats.org/drawingml/2006/wordprocessingDrawing" xmlns:w10="urn:schemas-microsoft-com:office:word" xmlns:w="http://schemas.openxmlformats.org/wordprocessingml/2006/main" xmlns:w14="http://schemas.microsoft.com/office/word/2010/wordml" xmlns:w15="http://schemas.microsoft.com/office/word/2012/wordml" xmlns:w16cex="http://schemas.microsoft.com/office/word/2018/wordml/cex" xmlns:w16cid="http://schemas.microsoft.com/office/word/2016/wordml/cid" xmlns:w16="http://schemas.microsoft.com/office/word/2018/wordml" xmlns:w16du="http://schemas.microsoft.com/office/word/2023/wordml/word16du" xmlns:w16sdtdh="http://schemas.microsoft.com/office/word/2020/wordml/sdtdatahash" xmlns:w16sdtfl="http://schemas.microsoft.com/office/word/2024/wordml/sdtformatlock" xmlns:w16se="http://schemas.microsoft.com/office/word/2015/wordml/symex" xmlns:wpg="http://schemas.microsoft.com/office/word/2010/wordprocessingGroup" xmlns:wpi="http://schemas.microsoft.com/office/word/2010/wordprocessingInk" xmlns:wne="http://schemas.microsoft.com/office/word/2006/wordml" xmlns:wps="http://schemas.microsoft.com/office/word/2010/wordprocessingShape" mc:Ignorable="w14 w15 w16se w16cid w16 w16cex w16sdtdh w16sdtfl w16du wp14">
   <w:body>
     <w:p>
       <w:pPr>
@@ -190,6 +190,18 @@
                 <w:b/>
               </w:rPr>
             </w:pPr>
+            <w:r>
+              <w:rPr>
+                <w:b/>
+              </w:rPr>
+              <w:t>2</w:t>
+            </w:r>
+            <w:r>
+              <w:rPr>
+                <w:b/>
+              </w:rPr>
+              <w:t>.1</w:t>
+            </w:r>
           </w:p>
         </w:tc>
       </w:tr>
@@ -226,6 +238,12 @@
                 <w:b/>
               </w:rPr>
             </w:pPr>
+            <w:r>
+              <w:rPr>
+                <w:b/>
+              </w:rPr>
+              <w:t>1.2</w:t>
+            </w:r>
           </w:p>
         </w:tc>
       </w:tr>
@@ -262,6 +280,12 @@
                 <w:b/>
               </w:rPr>
             </w:pPr>
+            <w:r>
+              <w:rPr>
+                <w:b/>
+              </w:rPr>
+              <w:t>0.43</w:t>
+            </w:r>
           </w:p>
         </w:tc>
       </w:tr>
@@ -298,6 +322,12 @@
                 <w:b/>
               </w:rPr>
             </w:pPr>
+            <w:r>
+              <w:rPr>
+                <w:b/>
+              </w:rPr>
+              <w:t>8.1</w:t>
+            </w:r>
           </w:p>
         </w:tc>
       </w:tr>
@@ -334,6 +364,12 @@
                 <w:b/>
               </w:rPr>
             </w:pPr>
+            <w:r>
+              <w:rPr>
+                <w:b/>
+              </w:rPr>
+              <w:t>0.8</w:t>
+            </w:r>
           </w:p>
         </w:tc>
       </w:tr>
@@ -376,6 +412,12 @@
                 <w:b/>
               </w:rPr>
             </w:pPr>
+            <w:r>
+              <w:rPr>
+                <w:b/>
+              </w:rPr>
+              <w:t>3.2</w:t>
+            </w:r>
           </w:p>
         </w:tc>
       </w:tr>
@@ -395,6 +437,12 @@
                 <w:b/>
               </w:rPr>
             </w:pPr>
+            <w:r>
+              <w:rPr>
+                <w:b/>
+              </w:rPr>
+              <w:t>20.1</w:t>
+            </w:r>
           </w:p>
         </w:tc>
         <w:tc>
@@ -434,6 +482,12 @@
                 <w:b/>
               </w:rPr>
             </w:pPr>
+            <w:r>
+              <w:rPr>
+                <w:b/>
+              </w:rPr>
+              <w:t>4,8</w:t>
+            </w:r>
           </w:p>
         </w:tc>
         <w:tc>
@@ -470,6 +524,12 @@
                 <w:b/>
               </w:rPr>
             </w:pPr>
+            <w:r>
+              <w:rPr>
+                <w:b/>
+              </w:rPr>
+              <w:t>6.5</w:t>
+            </w:r>
           </w:p>
         </w:tc>
         <w:tc>
@@ -506,6 +566,12 @@
                 <w:b/>
               </w:rPr>
             </w:pPr>
+            <w:r>
+              <w:rPr>
+                <w:b/>
+              </w:rPr>
+              <w:t>8</w:t>
+            </w:r>
           </w:p>
         </w:tc>
         <w:tc>
@@ -542,6 +608,12 @@
                 <w:b/>
               </w:rPr>
             </w:pPr>
+            <w:r>
+              <w:rPr>
+                <w:b/>
+              </w:rPr>
+              <w:t>80.1</w:t>
+            </w:r>
           </w:p>
         </w:tc>
         <w:tc>
@@ -568,8 +640,6 @@
               </w:rPr>
               <w:t>,</w:t>
             </w:r>
-            <w:bookmarkStart w:id="0" w:name="_GoBack"/>
-            <w:bookmarkEnd w:id="0"/>
             <w:r>
               <w:rPr>
                 <w:b/>
@@ -607,6 +677,12 @@
                 <w:b/>
               </w:rPr>
             </w:pPr>
+            <w:r>
+              <w:rPr>
+                <w:b/>
+              </w:rPr>
+              <w:t>59.9</w:t>
+            </w:r>
           </w:p>
         </w:tc>
         <w:tc>
@@ -649,6 +725,12 @@
                 <w:b/>
               </w:rPr>
             </w:pPr>
+            <w:r>
+              <w:rPr>
+                <w:b/>
+              </w:rPr>
+              <w:t>38.8</w:t>
+            </w:r>
           </w:p>
         </w:tc>
         <w:tc>
@@ -980,6 +1062,9 @@
       <w:r>
         <w:t>Quelle est la fréquence d’échantillonnage minimale pour ne pas engendrer de perte ?</w:t>
       </w:r>
+      <w:r>
+        <w:t xml:space="preserve"> 24Hz</w:t>
+      </w:r>
     </w:p>
     <w:p>
       <w:pPr>
@@ -1007,6 +1092,9 @@
       <w:r>
         <w:t>Le débit de chaque canal.</w:t>
       </w:r>
+      <w:r>
+        <w:t xml:space="preserve"> 1152kbit/s</w:t>
+      </w:r>
     </w:p>
     <w:p>
       <w:pPr>
@@ -1022,6 +1110,9 @@
       <w:r>
         <w:t>Le débit total pour les 5 canaux.</w:t>
       </w:r>
+      <w:r>
+        <w:t xml:space="preserve"> 5760 kbits/s</w:t>
+      </w:r>
     </w:p>
     <w:p>
       <w:pPr>
@@ -1045,6 +1136,153 @@
       <w:pPr>
         <w:pStyle w:val="Paragraphedeliste"/>
         <w:numPr>
+          <w:ilvl w:val="2"/>
+          <w:numId w:val="5"/>
+        </w:numPr>
+        <w:spacing w:after="240"/>
+        <w:contextualSpacing w:val="0"/>
+      </w:pPr>
+      <w:r>
+        <w:t>0.0392</w:t>
+      </w:r>
+      <w:r>
+        <w:t xml:space="preserve"> </w:t>
+      </w:r>
+      <w:r>
+        <w:t>G</w:t>
+      </w:r>
+      <w:r>
+        <w:t>o</w:t>
+      </w:r>
+    </w:p>
+    <w:p>
+      <w:pPr>
+        <w:pStyle w:val="Paragraphedeliste"/>
+        <w:numPr>
+          <w:ilvl w:val="2"/>
+          <w:numId w:val="5"/>
+        </w:numPr>
+        <w:spacing w:after="240"/>
+        <w:contextualSpacing w:val="0"/>
+      </w:pPr>
+      <w:r>
+        <w:t>35</w:t>
+      </w:r>
+      <w:r>
+        <w:t>.</w:t>
+      </w:r>
+      <w:r>
+        <w:t xml:space="preserve">509 </w:t>
+      </w:r>
+      <w:r>
+        <w:t>G</w:t>
+      </w:r>
+      <w:r>
+        <w:t>o</w:t>
+      </w:r>
+    </w:p>
+    <w:p>
+      <w:pPr>
+        <w:pStyle w:val="Paragraphedeliste"/>
+        <w:numPr>
+          <w:ilvl w:val="2"/>
+          <w:numId w:val="5"/>
+        </w:numPr>
+        <w:spacing w:after="240"/>
+        <w:contextualSpacing w:val="0"/>
+      </w:pPr>
+      <w:r>
+        <w:t>0.0</w:t>
+      </w:r>
+      <w:r>
+        <w:t>46</w:t>
+      </w:r>
+      <w:r>
+        <w:t>2</w:t>
+      </w:r>
+      <w:r>
+        <w:t xml:space="preserve"> </w:t>
+      </w:r>
+      <w:r>
+        <w:t>G</w:t>
+      </w:r>
+      <w:r>
+        <w:t>o</w:t>
+      </w:r>
+    </w:p>
+    <w:p>
+      <w:pPr>
+        <w:pStyle w:val="Paragraphedeliste"/>
+        <w:numPr>
+          <w:ilvl w:val="2"/>
+          <w:numId w:val="5"/>
+        </w:numPr>
+        <w:spacing w:after="240"/>
+        <w:contextualSpacing w:val="0"/>
+      </w:pPr>
+      <w:r>
+        <w:t>0.0</w:t>
+      </w:r>
+      <w:r>
+        <w:t xml:space="preserve">306 </w:t>
+      </w:r>
+      <w:r>
+        <w:t>G</w:t>
+      </w:r>
+      <w:r>
+        <w:t>o</w:t>
+      </w:r>
+    </w:p>
+    <w:p>
+      <w:pPr>
+        <w:pStyle w:val="Paragraphedeliste"/>
+        <w:numPr>
+          <w:ilvl w:val="2"/>
+          <w:numId w:val="5"/>
+        </w:numPr>
+        <w:spacing w:after="240"/>
+        <w:contextualSpacing w:val="0"/>
+      </w:pPr>
+      <w:r>
+        <w:t>0.0</w:t>
+      </w:r>
+      <w:r>
+        <w:t xml:space="preserve">714 </w:t>
+      </w:r>
+      <w:r>
+        <w:t>G</w:t>
+      </w:r>
+      <w:r>
+        <w:t>o</w:t>
+      </w:r>
+    </w:p>
+    <w:p>
+      <w:pPr>
+        <w:pStyle w:val="Paragraphedeliste"/>
+        <w:numPr>
+          <w:ilvl w:val="2"/>
+          <w:numId w:val="5"/>
+        </w:numPr>
+        <w:spacing w:after="240"/>
+        <w:contextualSpacing w:val="0"/>
+      </w:pPr>
+      <w:r>
+        <w:t>0.</w:t>
+      </w:r>
+      <w:r>
+        <w:t xml:space="preserve">230 </w:t>
+      </w:r>
+      <w:r>
+        <w:t>G</w:t>
+      </w:r>
+      <w:r>
+        <w:t>o</w:t>
+      </w:r>
+    </w:p>
+    <w:p>
+      <w:pPr>
+        <w:pStyle w:val="Paragraphedeliste"/>
+        <w:numPr>
           <w:ilvl w:val="0"/>
           <w:numId w:val="5"/>
         </w:numPr>
@@ -1092,6 +1330,12 @@
         </w:rPr>
         <w:t>Supposons que l’on garde seulement deux canaux par chanson, combien de CD sont alors nécessaires ?</w:t>
       </w:r>
+      <w:r>
+        <w:rPr>
+          <w:rFonts w:cstheme="minorHAnsi"/>
+        </w:rPr>
+        <w:t xml:space="preserve"> 94 CD.</w:t>
+      </w:r>
     </w:p>
     <w:p>
       <w:pPr>
@@ -1109,6 +1353,24 @@
           <w:rFonts w:cstheme="minorHAnsi"/>
         </w:rPr>
         <w:t>Combien de DVD d’une capacité de stockage de 8.5Go sont nécessaire pour enregistrer l’album au complet ?</w:t>
+      </w:r>
+      <w:r>
+        <w:rPr>
+          <w:rFonts w:cstheme="minorHAnsi"/>
+        </w:rPr>
+        <w:t xml:space="preserve"> 5 DVD de 8.5</w:t>
+      </w:r>
+      <w:r>
+        <w:rPr>
+          <w:rFonts w:cstheme="minorHAnsi"/>
+        </w:rPr>
+        <w:t xml:space="preserve"> </w:t>
+      </w:r>
+      <w:r>
+        <w:rPr>
+          <w:rFonts w:cstheme="minorHAnsi"/>
+        </w:rPr>
+        <w:t>Go</w:t>
       </w:r>
     </w:p>
     <w:p>
@@ -1152,6 +1414,9 @@
       <w:r>
         <w:t>Le débit de chaque canal.</w:t>
       </w:r>
+      <w:r>
+        <w:t xml:space="preserve"> 2822.4 KHz</w:t>
+      </w:r>
     </w:p>
     <w:p>
       <w:pPr>
@@ -1171,6 +1436,9 @@
       </w:r>
       <w:r>
         <w:t xml:space="preserve"> canaux.</w:t>
+      </w:r>
+      <w:r>
+        <w:t xml:space="preserve"> 5644.8 KHz</w:t>
       </w:r>
     </w:p>
     <w:p>
@@ -1248,6 +1516,7 @@
         <w:pStyle w:val="Titre2"/>
       </w:pPr>
       <w:r>
+        <w:lastRenderedPageBreak/>
         <w:t>2</w:t>
       </w:r>
       <w:r>
@@ -1524,7 +1793,6 @@
         <w:rPr>
           <w:rFonts w:cstheme="minorHAnsi"/>
         </w:rPr>
-        <w:lastRenderedPageBreak/>
         <w:t>Combien de CD d’une capacité de stockage de 650M</w:t>
       </w:r>
       <w:r>
@@ -2019,6 +2287,7 @@
         <w:pStyle w:val="Titre2"/>
       </w:pPr>
       <w:r>
+        <w:lastRenderedPageBreak/>
         <w:t>3.2 RSB</w:t>
       </w:r>
       <w:r>
@@ -2768,7 +3037,6 @@
         <w:contextualSpacing w:val="0"/>
       </w:pPr>
       <w:r>
-        <w:lastRenderedPageBreak/>
         <w:t xml:space="preserve">Une ligne avec un </w:t>
       </w:r>
       <m:oMath>
@@ -3065,7 +3333,7 @@
 </file>
 
 <file path=word/endnotes.xml><?xml version="1.0" encoding="utf-8"?>
-<w:endnotes xmlns:wpc="http://schemas.microsoft.com/office/word/2010/wordprocessingCanvas" xmlns:mc="http://schemas.openxmlformats.org/markup-compatibility/2006" xmlns:o="urn:schemas-microsoft-com:office:office" xmlns:r="http://schemas.openxmlformats.org/officeDocument/2006/relationships" xmlns:m="http://schemas.openxmlformats.org/officeDocument/2006/math" xmlns:v="urn:schemas-microsoft-com:vml" xmlns:wp14="http://schemas.microsoft.com/office/word/2010/wordprocessingDrawing" xmlns:wp="http://schemas.openxmlformats.org/drawingml/2006/wordprocessingDrawing" xmlns:w10="urn:schemas-microsoft-com:office:word" xmlns:w="http://schemas.openxmlformats.org/wordprocessingml/2006/main" xmlns:w14="http://schemas.microsoft.com/office/word/2010/wordml" xmlns:w15="http://schemas.microsoft.com/office/word/2012/wordml" xmlns:wpg="http://schemas.microsoft.com/office/word/2010/wordprocessingGroup" xmlns:wpi="http://schemas.microsoft.com/office/word/2010/wordprocessingInk" xmlns:wne="http://schemas.microsoft.com/office/word/2006/wordml" xmlns:wps="http://schemas.microsoft.com/office/word/2010/wordprocessingShape" mc:Ignorable="w14 w15 wp14">
+<w:endnotes xmlns:wpc="http://schemas.microsoft.com/office/word/2010/wordprocessingCanvas" xmlns:cx="http://schemas.microsoft.com/office/drawing/2014/chartex" xmlns:cx1="http://schemas.microsoft.com/office/drawing/2015/9/8/chartex" xmlns:cx2="http://schemas.microsoft.com/office/drawing/2015/10/21/chartex" xmlns:cx3="http://schemas.microsoft.com/office/drawing/2016/5/9/chartex" xmlns:cx4="http://schemas.microsoft.com/office/drawing/2016/5/10/chartex" xmlns:cx5="http://schemas.microsoft.com/office/drawing/2016/5/11/chartex" xmlns:cx6="http://schemas.microsoft.com/office/drawing/2016/5/12/chartex" xmlns:cx7="http://schemas.microsoft.com/office/drawing/2016/5/13/chartex" xmlns:cx8="http://schemas.microsoft.com/office/drawing/2016/5/14/chartex" xmlns:mc="http://schemas.openxmlformats.org/markup-compatibility/2006" xmlns:aink="http://schemas.microsoft.com/office/drawing/2016/ink" xmlns:am3d="http://schemas.microsoft.com/office/drawing/2017/model3d" xmlns:o="urn:schemas-microsoft-com:office:office" xmlns:oel="http://schemas.microsoft.com/office/2019/extlst" xmlns:r="http://schemas.openxmlformats.org/officeDocument/2006/relationships" xmlns:m="http://schemas.openxmlformats.org/officeDocument/2006/math" xmlns:v="urn:schemas-microsoft-com:vml" xmlns:wp14="http://schemas.microsoft.com/office/word/2010/wordprocessingDrawing" xmlns:wp="http://schemas.openxmlformats.org/drawingml/2006/wordprocessingDrawing" xmlns:w10="urn:schemas-microsoft-com:office:word" xmlns:w="http://schemas.openxmlformats.org/wordprocessingml/2006/main" xmlns:w14="http://schemas.microsoft.com/office/word/2010/wordml" xmlns:w15="http://schemas.microsoft.com/office/word/2012/wordml" xmlns:w16cex="http://schemas.microsoft.com/office/word/2018/wordml/cex" xmlns:w16cid="http://schemas.microsoft.com/office/word/2016/wordml/cid" xmlns:w16="http://schemas.microsoft.com/office/word/2018/wordml" xmlns:w16du="http://schemas.microsoft.com/office/word/2023/wordml/word16du" xmlns:w16sdtdh="http://schemas.microsoft.com/office/word/2020/wordml/sdtdatahash" xmlns:w16sdtfl="http://schemas.microsoft.com/office/word/2024/wordml/sdtformatlock" xmlns:w16se="http://schemas.microsoft.com/office/word/2015/wordml/symex" xmlns:wpg="http://schemas.microsoft.com/office/word/2010/wordprocessingGroup" xmlns:wpi="http://schemas.microsoft.com/office/word/2010/wordprocessingInk" xmlns:wne="http://schemas.microsoft.com/office/word/2006/wordml" xmlns:wps="http://schemas.microsoft.com/office/word/2010/wordprocessingShape" mc:Ignorable="w14 w15 w16se w16cid w16 w16cex w16sdtdh w16sdtfl w16du wp14">
   <w:endnote w:type="separator" w:id="-1">
     <w:p>
       <w:pPr>
@@ -3090,7 +3358,7 @@
 </file>
 
 <file path=word/footnotes.xml><?xml version="1.0" encoding="utf-8"?>
-<w:footnotes xmlns:wpc="http://schemas.microsoft.com/office/word/2010/wordprocessingCanvas" xmlns:mc="http://schemas.openxmlformats.org/markup-compatibility/2006" xmlns:o="urn:schemas-microsoft-com:office:office" xmlns:r="http://schemas.openxmlformats.org/officeDocument/2006/relationships" xmlns:m="http://schemas.openxmlformats.org/officeDocument/2006/math" xmlns:v="urn:schemas-microsoft-com:vml" xmlns:wp14="http://schemas.microsoft.com/office/word/2010/wordprocessingDrawing" xmlns:wp="http://schemas.openxmlformats.org/drawingml/2006/wordprocessingDrawing" xmlns:w10="urn:schemas-microsoft-com:office:word" xmlns:w="http://schemas.openxmlformats.org/wordprocessingml/2006/main" xmlns:w14="http://schemas.microsoft.com/office/word/2010/wordml" xmlns:w15="http://schemas.microsoft.com/office/word/2012/wordml" xmlns:wpg="http://schemas.microsoft.com/office/word/2010/wordprocessingGroup" xmlns:wpi="http://schemas.microsoft.com/office/word/2010/wordprocessingInk" xmlns:wne="http://schemas.microsoft.com/office/word/2006/wordml" xmlns:wps="http://schemas.microsoft.com/office/word/2010/wordprocessingShape" mc:Ignorable="w14 w15 wp14">
+<w:footnotes xmlns:wpc="http://schemas.microsoft.com/office/word/2010/wordprocessingCanvas" xmlns:cx="http://schemas.microsoft.com/office/drawing/2014/chartex" xmlns:cx1="http://schemas.microsoft.com/office/drawing/2015/9/8/chartex" xmlns:cx2="http://schemas.microsoft.com/office/drawing/2015/10/21/chartex" xmlns:cx3="http://schemas.microsoft.com/office/drawing/2016/5/9/chartex" xmlns:cx4="http://schemas.microsoft.com/office/drawing/2016/5/10/chartex" xmlns:cx5="http://schemas.microsoft.com/office/drawing/2016/5/11/chartex" xmlns:cx6="http://schemas.microsoft.com/office/drawing/2016/5/12/chartex" xmlns:cx7="http://schemas.microsoft.com/office/drawing/2016/5/13/chartex" xmlns:cx8="http://schemas.microsoft.com/office/drawing/2016/5/14/chartex" xmlns:mc="http://schemas.openxmlformats.org/markup-compatibility/2006" xmlns:aink="http://schemas.microsoft.com/office/drawing/2016/ink" xmlns:am3d="http://schemas.microsoft.com/office/drawing/2017/model3d" xmlns:o="urn:schemas-microsoft-com:office:office" xmlns:oel="http://schemas.microsoft.com/office/2019/extlst" xmlns:r="http://schemas.openxmlformats.org/officeDocument/2006/relationships" xmlns:m="http://schemas.openxmlformats.org/officeDocument/2006/math" xmlns:v="urn:schemas-microsoft-com:vml" xmlns:wp14="http://schemas.microsoft.com/office/word/2010/wordprocessingDrawing" xmlns:wp="http://schemas.openxmlformats.org/drawingml/2006/wordprocessingDrawing" xmlns:w10="urn:schemas-microsoft-com:office:word" xmlns:w="http://schemas.openxmlformats.org/wordprocessingml/2006/main" xmlns:w14="http://schemas.microsoft.com/office/word/2010/wordml" xmlns:w15="http://schemas.microsoft.com/office/word/2012/wordml" xmlns:w16cex="http://schemas.microsoft.com/office/word/2018/wordml/cex" xmlns:w16cid="http://schemas.microsoft.com/office/word/2016/wordml/cid" xmlns:w16="http://schemas.microsoft.com/office/word/2018/wordml" xmlns:w16du="http://schemas.microsoft.com/office/word/2023/wordml/word16du" xmlns:w16sdtdh="http://schemas.microsoft.com/office/word/2020/wordml/sdtdatahash" xmlns:w16sdtfl="http://schemas.microsoft.com/office/word/2024/wordml/sdtformatlock" xmlns:w16se="http://schemas.microsoft.com/office/word/2015/wordml/symex" xmlns:wpg="http://schemas.microsoft.com/office/word/2010/wordprocessingGroup" xmlns:wpi="http://schemas.microsoft.com/office/word/2010/wordprocessingInk" xmlns:wne="http://schemas.microsoft.com/office/word/2006/wordml" xmlns:wps="http://schemas.microsoft.com/office/word/2010/wordprocessingShape" mc:Ignorable="w14 w15 w16se w16cid w16 w16cex w16sdtdh w16sdtfl w16du wp14">
   <w:footnote w:type="separator" w:id="-1">
     <w:p>
       <w:pPr>
@@ -3115,7 +3383,7 @@
 </file>
 
 <file path=word/header1.xml><?xml version="1.0" encoding="utf-8"?>
-<w:hdr xmlns:wpc="http://schemas.microsoft.com/office/word/2010/wordprocessingCanvas" xmlns:mc="http://schemas.openxmlformats.org/markup-compatibility/2006" xmlns:o="urn:schemas-microsoft-com:office:office" xmlns:r="http://schemas.openxmlformats.org/officeDocument/2006/relationships" xmlns:m="http://schemas.openxmlformats.org/officeDocument/2006/math" xmlns:v="urn:schemas-microsoft-com:vml" xmlns:wp14="http://schemas.microsoft.com/office/word/2010/wordprocessingDrawing" xmlns:wp="http://schemas.openxmlformats.org/drawingml/2006/wordprocessingDrawing" xmlns:w10="urn:schemas-microsoft-com:office:word" xmlns:w="http://schemas.openxmlformats.org/wordprocessingml/2006/main" xmlns:w14="http://schemas.microsoft.com/office/word/2010/wordml" xmlns:w15="http://schemas.microsoft.com/office/word/2012/wordml" xmlns:wpg="http://schemas.microsoft.com/office/word/2010/wordprocessingGroup" xmlns:wpi="http://schemas.microsoft.com/office/word/2010/wordprocessingInk" xmlns:wne="http://schemas.microsoft.com/office/word/2006/wordml" xmlns:wps="http://schemas.microsoft.com/office/word/2010/wordprocessingShape" mc:Ignorable="w14 w15 wp14">
+<w:hdr xmlns:wpc="http://schemas.microsoft.com/office/word/2010/wordprocessingCanvas" xmlns:cx="http://schemas.microsoft.com/office/drawing/2014/chartex" xmlns:cx1="http://schemas.microsoft.com/office/drawing/2015/9/8/chartex" xmlns:cx2="http://schemas.microsoft.com/office/drawing/2015/10/21/chartex" xmlns:cx3="http://schemas.microsoft.com/office/drawing/2016/5/9/chartex" xmlns:cx4="http://schemas.microsoft.com/office/drawing/2016/5/10/chartex" xmlns:cx5="http://schemas.microsoft.com/office/drawing/2016/5/11/chartex" xmlns:cx6="http://schemas.microsoft.com/office/drawing/2016/5/12/chartex" xmlns:cx7="http://schemas.microsoft.com/office/drawing/2016/5/13/chartex" xmlns:cx8="http://schemas.microsoft.com/office/drawing/2016/5/14/chartex" xmlns:mc="http://schemas.openxmlformats.org/markup-compatibility/2006" xmlns:aink="http://schemas.microsoft.com/office/drawing/2016/ink" xmlns:am3d="http://schemas.microsoft.com/office/drawing/2017/model3d" xmlns:o="urn:schemas-microsoft-com:office:office" xmlns:oel="http://schemas.microsoft.com/office/2019/extlst" xmlns:r="http://schemas.openxmlformats.org/officeDocument/2006/relationships" xmlns:m="http://schemas.openxmlformats.org/officeDocument/2006/math" xmlns:v="urn:schemas-microsoft-com:vml" xmlns:wp14="http://schemas.microsoft.com/office/word/2010/wordprocessingDrawing" xmlns:wp="http://schemas.openxmlformats.org/drawingml/2006/wordprocessingDrawing" xmlns:w10="urn:schemas-microsoft-com:office:word" xmlns:w="http://schemas.openxmlformats.org/wordprocessingml/2006/main" xmlns:w14="http://schemas.microsoft.com/office/word/2010/wordml" xmlns:w15="http://schemas.microsoft.com/office/word/2012/wordml" xmlns:w16cex="http://schemas.microsoft.com/office/word/2018/wordml/cex" xmlns:w16cid="http://schemas.microsoft.com/office/word/2016/wordml/cid" xmlns:w16="http://schemas.microsoft.com/office/word/2018/wordml" xmlns:w16du="http://schemas.microsoft.com/office/word/2023/wordml/word16du" xmlns:w16sdtdh="http://schemas.microsoft.com/office/word/2020/wordml/sdtdatahash" xmlns:w16sdtfl="http://schemas.microsoft.com/office/word/2024/wordml/sdtformatlock" xmlns:w16se="http://schemas.microsoft.com/office/word/2015/wordml/symex" xmlns:wpg="http://schemas.microsoft.com/office/word/2010/wordprocessingGroup" xmlns:wpi="http://schemas.microsoft.com/office/word/2010/wordprocessingInk" xmlns:wne="http://schemas.microsoft.com/office/word/2006/wordml" xmlns:wps="http://schemas.microsoft.com/office/word/2010/wordprocessingShape" mc:Ignorable="w14 w15 w16se w16cid w16 w16cex w16sdtdh w16sdtfl w16du wp14">
   <w:p>
     <w:pPr>
       <w:pStyle w:val="Pieddepage"/>
@@ -3158,7 +3426,7 @@
 </file>
 
 <file path=word/numbering.xml><?xml version="1.0" encoding="utf-8"?>
-<w:numbering xmlns:wpc="http://schemas.microsoft.com/office/word/2010/wordprocessingCanvas" xmlns:mc="http://schemas.openxmlformats.org/markup-compatibility/2006" xmlns:o="urn:schemas-microsoft-com:office:office" xmlns:r="http://schemas.openxmlformats.org/officeDocument/2006/relationships" xmlns:m="http://schemas.openxmlformats.org/officeDocument/2006/math" xmlns:v="urn:schemas-microsoft-com:vml" xmlns:wp14="http://schemas.microsoft.com/office/word/2010/wordprocessingDrawing" xmlns:wp="http://schemas.openxmlformats.org/drawingml/2006/wordprocessingDrawing" xmlns:w10="urn:schemas-microsoft-com:office:word" xmlns:w="http://schemas.openxmlformats.org/wordprocessingml/2006/main" xmlns:w14="http://schemas.microsoft.com/office/word/2010/wordml" xmlns:w15="http://schemas.microsoft.com/office/word/2012/wordml" xmlns:wpg="http://schemas.microsoft.com/office/word/2010/wordprocessingGroup" xmlns:wpi="http://schemas.microsoft.com/office/word/2010/wordprocessingInk" xmlns:wne="http://schemas.microsoft.com/office/word/2006/wordml" xmlns:wps="http://schemas.microsoft.com/office/word/2010/wordprocessingShape" mc:Ignorable="w14 w15 wp14">
+<w:numbering xmlns:wpc="http://schemas.microsoft.com/office/word/2010/wordprocessingCanvas" xmlns:cx="http://schemas.microsoft.com/office/drawing/2014/chartex" xmlns:cx1="http://schemas.microsoft.com/office/drawing/2015/9/8/chartex" xmlns:cx2="http://schemas.microsoft.com/office/drawing/2015/10/21/chartex" xmlns:cx3="http://schemas.microsoft.com/office/drawing/2016/5/9/chartex" xmlns:cx4="http://schemas.microsoft.com/office/drawing/2016/5/10/chartex" xmlns:cx5="http://schemas.microsoft.com/office/drawing/2016/5/11/chartex" xmlns:cx6="http://schemas.microsoft.com/office/drawing/2016/5/12/chartex" xmlns:cx7="http://schemas.microsoft.com/office/drawing/2016/5/13/chartex" xmlns:cx8="http://schemas.microsoft.com/office/drawing/2016/5/14/chartex" xmlns:mc="http://schemas.openxmlformats.org/markup-compatibility/2006" xmlns:aink="http://schemas.microsoft.com/office/drawing/2016/ink" xmlns:am3d="http://schemas.microsoft.com/office/drawing/2017/model3d" xmlns:o="urn:schemas-microsoft-com:office:office" xmlns:oel="http://schemas.microsoft.com/office/2019/extlst" xmlns:r="http://schemas.openxmlformats.org/officeDocument/2006/relationships" xmlns:m="http://schemas.openxmlformats.org/officeDocument/2006/math" xmlns:v="urn:schemas-microsoft-com:vml" xmlns:wp14="http://schemas.microsoft.com/office/word/2010/wordprocessingDrawing" xmlns:wp="http://schemas.openxmlformats.org/drawingml/2006/wordprocessingDrawing" xmlns:w10="urn:schemas-microsoft-com:office:word" xmlns:w="http://schemas.openxmlformats.org/wordprocessingml/2006/main" xmlns:w14="http://schemas.microsoft.com/office/word/2010/wordml" xmlns:w15="http://schemas.microsoft.com/office/word/2012/wordml" xmlns:w16cex="http://schemas.microsoft.com/office/word/2018/wordml/cex" xmlns:w16cid="http://schemas.microsoft.com/office/word/2016/wordml/cid" xmlns:w16="http://schemas.microsoft.com/office/word/2018/wordml" xmlns:w16du="http://schemas.microsoft.com/office/word/2023/wordml/word16du" xmlns:w16sdtdh="http://schemas.microsoft.com/office/word/2020/wordml/sdtdatahash" xmlns:w16sdtfl="http://schemas.microsoft.com/office/word/2024/wordml/sdtformatlock" xmlns:w16se="http://schemas.microsoft.com/office/word/2015/wordml/symex" xmlns:wpg="http://schemas.microsoft.com/office/word/2010/wordprocessingGroup" xmlns:wpi="http://schemas.microsoft.com/office/word/2010/wordprocessingInk" xmlns:wne="http://schemas.microsoft.com/office/word/2006/wordml" xmlns:wps="http://schemas.microsoft.com/office/word/2010/wordprocessingShape" mc:Ignorable="w14 w15 w16se w16cid w16 w16cex w16sdtdh w16sdtfl w16du wp14">
   <w:abstractNum w:abstractNumId="0" w15:restartNumberingAfterBreak="0">
     <w:nsid w:val="0D42467C"/>
     <w:multiLevelType w:val="hybridMultilevel"/>
@@ -3451,7 +3719,7 @@
         <w:ind w:left="1440" w:hanging="360"/>
       </w:pPr>
     </w:lvl>
-    <w:lvl w:ilvl="2" w:tplc="0C0C001B" w:tentative="1">
+    <w:lvl w:ilvl="2" w:tplc="0C0C001B">
       <w:start w:val="1"/>
       <w:numFmt w:val="lowerRoman"/>
       <w:lvlText w:val="%3."/>
@@ -4046,41 +4314,41 @@
       </w:pPr>
     </w:lvl>
   </w:abstractNum>
-  <w:num w:numId="1">
+  <w:num w:numId="1" w16cid:durableId="1115367895">
     <w:abstractNumId w:val="0"/>
   </w:num>
-  <w:num w:numId="2">
+  <w:num w:numId="2" w16cid:durableId="791171625">
     <w:abstractNumId w:val="4"/>
   </w:num>
-  <w:num w:numId="3">
+  <w:num w:numId="3" w16cid:durableId="1828128255">
     <w:abstractNumId w:val="2"/>
   </w:num>
-  <w:num w:numId="4">
+  <w:num w:numId="4" w16cid:durableId="916474211">
     <w:abstractNumId w:val="8"/>
   </w:num>
-  <w:num w:numId="5">
+  <w:num w:numId="5" w16cid:durableId="956527680">
     <w:abstractNumId w:val="3"/>
   </w:num>
-  <w:num w:numId="6">
+  <w:num w:numId="6" w16cid:durableId="1036348417">
     <w:abstractNumId w:val="6"/>
   </w:num>
-  <w:num w:numId="7">
+  <w:num w:numId="7" w16cid:durableId="1416708126">
     <w:abstractNumId w:val="5"/>
   </w:num>
-  <w:num w:numId="8">
+  <w:num w:numId="8" w16cid:durableId="878248504">
     <w:abstractNumId w:val="9"/>
   </w:num>
-  <w:num w:numId="9">
+  <w:num w:numId="9" w16cid:durableId="482235811">
     <w:abstractNumId w:val="7"/>
   </w:num>
-  <w:num w:numId="10">
+  <w:num w:numId="10" w16cid:durableId="633608251">
     <w:abstractNumId w:val="1"/>
   </w:num>
 </w:numbering>
 </file>
 
 <file path=word/styles.xml><?xml version="1.0" encoding="utf-8"?>
-<w:styles xmlns:mc="http://schemas.openxmlformats.org/markup-compatibility/2006" xmlns:r="http://schemas.openxmlformats.org/officeDocument/2006/relationships" xmlns:w="http://schemas.openxmlformats.org/wordprocessingml/2006/main" xmlns:w14="http://schemas.microsoft.com/office/word/2010/wordml" xmlns:w15="http://schemas.microsoft.com/office/word/2012/wordml" mc:Ignorable="w14 w15">
+<w:styles xmlns:mc="http://schemas.openxmlformats.org/markup-compatibility/2006" xmlns:r="http://schemas.openxmlformats.org/officeDocument/2006/relationships" xmlns:w="http://schemas.openxmlformats.org/wordprocessingml/2006/main" xmlns:w14="http://schemas.microsoft.com/office/word/2010/wordml" xmlns:w15="http://schemas.microsoft.com/office/word/2012/wordml" xmlns:w16cex="http://schemas.microsoft.com/office/word/2018/wordml/cex" xmlns:w16cid="http://schemas.microsoft.com/office/word/2016/wordml/cid" xmlns:w16="http://schemas.microsoft.com/office/word/2018/wordml" xmlns:w16du="http://schemas.microsoft.com/office/word/2023/wordml/word16du" xmlns:w16sdtdh="http://schemas.microsoft.com/office/word/2020/wordml/sdtdatahash" xmlns:w16sdtfl="http://schemas.microsoft.com/office/word/2024/wordml/sdtformatlock" xmlns:w16se="http://schemas.microsoft.com/office/word/2015/wordml/symex" mc:Ignorable="w14 w15 w16se w16cid w16 w16cex w16sdtdh w16sdtfl w16du">
   <w:docDefaults>
     <w:rPrDefault>
       <w:rPr>
@@ -4096,7 +4364,7 @@
       </w:pPr>
     </w:pPrDefault>
   </w:docDefaults>
-  <w:latentStyles w:defLockedState="0" w:defUIPriority="99" w:defSemiHidden="0" w:defUnhideWhenUsed="0" w:defQFormat="0" w:count="371">
+  <w:latentStyles w:defLockedState="0" w:defUIPriority="99" w:defSemiHidden="0" w:defUnhideWhenUsed="0" w:defQFormat="0" w:count="376">
     <w:lsdException w:name="Normal" w:uiPriority="0" w:qFormat="1"/>
     <w:lsdException w:name="heading 1" w:uiPriority="9" w:qFormat="1"/>
     <w:lsdException w:name="heading 2" w:semiHidden="1" w:uiPriority="9" w:unhideWhenUsed="1" w:qFormat="1"/>
@@ -4468,6 +4736,11 @@
     <w:lsdException w:name="List Table 5 Dark Accent 6" w:uiPriority="50"/>
     <w:lsdException w:name="List Table 6 Colorful Accent 6" w:uiPriority="51"/>
     <w:lsdException w:name="List Table 7 Colorful Accent 6" w:uiPriority="52"/>
+    <w:lsdException w:name="Mention" w:semiHidden="1" w:unhideWhenUsed="1"/>
+    <w:lsdException w:name="Smart Hyperlink" w:semiHidden="1" w:unhideWhenUsed="1"/>
+    <w:lsdException w:name="Hashtag" w:semiHidden="1" w:unhideWhenUsed="1"/>
+    <w:lsdException w:name="Unresolved Mention" w:semiHidden="1" w:unhideWhenUsed="1"/>
+    <w:lsdException w:name="Smart Link" w:semiHidden="1" w:unhideWhenUsed="1"/>
   </w:latentStyles>
   <w:style w:type="paragraph" w:default="1" w:styleId="Normal">
     <w:name w:val="Normal"/>

</xml_diff>